<commit_message>
Kim11_tema-3-unite-sonu-sorulari: gorsel alanlarina Shutter onizlemeleri yerlestirildi (2.3 bicimi)
</commit_message>
<xml_diff>
--- a/sorular/Kim11_tema-3-unite-sonu-sorulari.docx
+++ b/sorular/Kim11_tema-3-unite-sonu-sorulari.docx
@@ -3834,85 +3834,59 @@
         <w:t xml:space="preserve">) parçalanmasını hızlandırarak hava kalitesini iyileştirmeye yardımcı olmaktadır. Kaplama, yağmur suyuyla yıkanabilen ve zamanla aşınabilen bir tabakadır.</w:t>
       </w:r>
     </w:p>
-    <w:tbl>
-      <w:tblPr>
-        <w:tblW w:w="9000" w:type="dxa"/>
+    <w:p>
+      <w:pPr>
         <w:jc w:val="center"/>
-        <w:tblBorders>
-          <w:top w:val="single" w:sz="8" w:space="0" w:color="7F7F7F"/>
-          <w:left w:val="single" w:sz="8" w:space="0" w:color="7F7F7F"/>
-          <w:bottom w:val="single" w:sz="8" w:space="0" w:color="7F7F7F"/>
-          <w:right w:val="single" w:sz="8" w:space="0" w:color="7F7F7F"/>
-        </w:tblBorders>
-      </w:tblPr>
-      <w:tblGrid>
-        <w:gridCol w:w="9000"/>
-      </w:tblGrid>
-      <w:tr>
-        <w:tc>
-          <w:tcPr>
-            <w:tcW w:w="9000" w:type="dxa"/>
-            <w:shd w:val="clear" w:color="auto" w:fill="EDEDED"/>
-          </w:tcPr>
-          <w:p>
-            <w:pPr>
-              <w:jc w:val="both"/>
-              <w:rPr>
-                <w:rFonts w:ascii="Times New Roman" w:hAnsi="Times New Roman" w:cs="Times New Roman"/>
-                <w:lang w:val="tr-TR"/>
-              </w:rPr>
-            </w:pPr>
-            <w:r>
-              <w:rPr>
-                <w:rFonts w:ascii="Times New Roman" w:hAnsi="Times New Roman" w:cs="Times New Roman"/>
-                <w:lang w:val="tr-TR"/>
-              </w:rPr>
-              <w:t xml:space="preserve">GÖRSEL ALANI (Shutterstock)</w:t>
-            </w:r>
-          </w:p>
-          <w:p>
-            <w:pPr>
-              <w:jc w:val="both"/>
-              <w:rPr>
-                <w:rFonts w:ascii="Times New Roman" w:hAnsi="Times New Roman" w:cs="Times New Roman"/>
-                <w:lang w:val="tr-TR"/>
-              </w:rPr>
-            </w:pPr>
-            <w:r>
-              <w:rPr>
-                <w:rFonts w:ascii="Times New Roman" w:hAnsi="Times New Roman" w:cs="Times New Roman"/>
-                <w:lang w:val="tr-TR"/>
-              </w:rPr>
-              <w:t xml:space="preserve">Tarif: Şehirde yayalara ait, düzgün döşenmiş gri kaldırım taşları; arka planda trafik.</w:t>
-            </w:r>
-          </w:p>
-          <w:p>
-            <w:pPr>
-              <w:jc w:val="both"/>
-              <w:rPr>
-                <w:rFonts w:ascii="Times New Roman" w:hAnsi="Times New Roman" w:cs="Times New Roman"/>
-                <w:lang w:val="tr-TR"/>
-              </w:rPr>
-            </w:pPr>
-            <w:r>
-              <w:rPr>
-                <w:rFonts w:ascii="Times New Roman" w:hAnsi="Times New Roman" w:cs="Times New Roman"/>
-                <w:lang w:val="tr-TR"/>
-              </w:rPr>
-              <w:t xml:space="preserve">Shutter ID: 2777910497 (fotoğraf) — Weathered interlocking concrete paving stones, outdoor</w:t>
-            </w:r>
-          </w:p>
-        </w:tc>
-      </w:tr>
-    </w:tbl>
-    <w:p>
-      <w:pPr>
-        <w:jc w:val="both"/>
-        <w:rPr>
-          <w:rFonts w:ascii="Times New Roman" w:hAnsi="Times New Roman" w:cs="Times New Roman"/>
-          <w:lang w:val="tr-TR"/>
-        </w:rPr>
-      </w:pPr>
+      </w:pPr>
+      <w:r>
+        <w:drawing>
+          <wp:inline xmlns:a="http://schemas.openxmlformats.org/drawingml/2006/main" xmlns:pic="http://schemas.openxmlformats.org/drawingml/2006/picture">
+            <wp:extent cx="3085714" cy="2520000"/>
+            <wp:docPr id="900003" name="Picture 900003"/>
+            <wp:cNvGraphicFramePr>
+              <a:graphicFrameLocks noChangeAspect="1"/>
+            </wp:cNvGraphicFramePr>
+            <a:graphic>
+              <a:graphicData uri="http://schemas.openxmlformats.org/drawingml/2006/picture">
+                <pic:pic>
+                  <pic:nvPicPr>
+                    <pic:cNvPr id="0" name="2777910497_d.jpg"/>
+                    <pic:cNvPicPr/>
+                  </pic:nvPicPr>
+                  <pic:blipFill>
+                    <a:blip r:embed="rId11"/>
+                    <a:stretch>
+                      <a:fillRect/>
+                    </a:stretch>
+                  </pic:blipFill>
+                  <pic:spPr>
+                    <a:xfrm>
+                      <a:off x="0" y="0"/>
+                      <a:ext cx="3085714" cy="2520000"/>
+                    </a:xfrm>
+                    <a:prstGeom prst="rect"/>
+                  </pic:spPr>
+                </pic:pic>
+              </a:graphicData>
+            </a:graphic>
+          </wp:inline>
+        </w:drawing>
+      </w:r>
+    </w:p>
+    <w:p>
+      <w:pPr>
+        <w:jc w:val="center"/>
+      </w:pPr>
+      <w:r>
+        <w:rPr>
+          <w:rFonts w:ascii="Times New Roman" w:hAnsi="Times New Roman" w:cs="Times New Roman"/>
+          <w:b/>
+          <w:bCs/>
+          <w:highlight w:val="yellow"/>
+          <w:lang w:val="tr-TR"/>
+        </w:rPr>
+        <w:t xml:space="preserve">Shutter id: 2777910497</w:t>
+      </w:r>
     </w:p>
     <w:p>
       <w:pPr>
@@ -6783,85 +6757,59 @@
         <w:t xml:space="preserve">Kemal Bey’in ailesi Muğla’da, Güllük Körfezi’nde levrek ve çipura yetiştirilen bir balık çiftliği işletmektedir. Denizdeki kafes ağlarına zamanla yosun, midye ve diğer canlılar tutunmakta; ağların gözenekleri tıkandığında suyun yenilenmesi azalmakta ve balıklar yeterli oksijen alamamaktadır. Ağlar sık sık sudan çıkarılıp yıkanmakta, yıpranan plastik ağlar ise birkaç yılda bir yenilenmektedir. Bir firma Kemal Bey’e yüzeyi bakır oksit nanoparçacıklarıyla kaplanmış ağlar önermektedir. Firmaya göre bu ağlara canlılar tutunmamakta ve ağlar daha uzun süre kullanılabilmektedir. Kemal Bey’in üniversitede su ürünleri okuyan kızı Deniz, karar vermeden önce konuyu araştırmaya başlar.</w:t>
       </w:r>
     </w:p>
-    <w:tbl>
-      <w:tblPr>
-        <w:tblW w:w="9000" w:type="dxa"/>
+    <w:p>
+      <w:pPr>
         <w:jc w:val="center"/>
-        <w:tblBorders>
-          <w:top w:val="single" w:sz="8" w:space="0" w:color="7F7F7F"/>
-          <w:left w:val="single" w:sz="8" w:space="0" w:color="7F7F7F"/>
-          <w:bottom w:val="single" w:sz="8" w:space="0" w:color="7F7F7F"/>
-          <w:right w:val="single" w:sz="8" w:space="0" w:color="7F7F7F"/>
-        </w:tblBorders>
-      </w:tblPr>
-      <w:tblGrid>
-        <w:gridCol w:w="9000"/>
-      </w:tblGrid>
-      <w:tr>
-        <w:tc>
-          <w:tcPr>
-            <w:tcW w:w="9000" w:type="dxa"/>
-            <w:shd w:val="clear" w:color="auto" w:fill="EDEDED"/>
-          </w:tcPr>
-          <w:p>
-            <w:pPr>
-              <w:jc w:val="both"/>
-              <w:rPr>
-                <w:rFonts w:ascii="Times New Roman" w:hAnsi="Times New Roman" w:cs="Times New Roman"/>
-                <w:lang w:val="tr-TR"/>
-              </w:rPr>
-            </w:pPr>
-            <w:r>
-              <w:rPr>
-                <w:rFonts w:ascii="Times New Roman" w:hAnsi="Times New Roman" w:cs="Times New Roman"/>
-                <w:lang w:val="tr-TR"/>
-              </w:rPr>
-              <w:t xml:space="preserve">GÖRSEL ALANI (Shutterstock)</w:t>
-            </w:r>
-          </w:p>
-          <w:p>
-            <w:pPr>
-              <w:jc w:val="both"/>
-              <w:rPr>
-                <w:rFonts w:ascii="Times New Roman" w:hAnsi="Times New Roman" w:cs="Times New Roman"/>
-                <w:lang w:val="tr-TR"/>
-              </w:rPr>
-            </w:pPr>
-            <w:r>
-              <w:rPr>
-                <w:rFonts w:ascii="Times New Roman" w:hAnsi="Times New Roman" w:cs="Times New Roman"/>
-                <w:lang w:val="tr-TR"/>
-              </w:rPr>
-              <w:t xml:space="preserve">Tarif: Sakin bir körfezde, yüzeyde dairesel balık yetiştirme kafesleri ve ağları; arka planda kıyı.</w:t>
-            </w:r>
-          </w:p>
-          <w:p>
-            <w:pPr>
-              <w:jc w:val="both"/>
-              <w:rPr>
-                <w:rFonts w:ascii="Times New Roman" w:hAnsi="Times New Roman" w:cs="Times New Roman"/>
-                <w:lang w:val="tr-TR"/>
-              </w:rPr>
-            </w:pPr>
-            <w:r>
-              <w:rPr>
-                <w:rFonts w:ascii="Times New Roman" w:hAnsi="Times New Roman" w:cs="Times New Roman"/>
-                <w:lang w:val="tr-TR"/>
-              </w:rPr>
-              <w:t xml:space="preserve">Shutter ID: 2766080725 (fotoğraf) — Aquaculture fish cages for breeding fish, fish farm in Adriatic Sea</w:t>
-            </w:r>
-          </w:p>
-        </w:tc>
-      </w:tr>
-    </w:tbl>
-    <w:p>
-      <w:pPr>
-        <w:jc w:val="both"/>
-        <w:rPr>
-          <w:rFonts w:ascii="Times New Roman" w:hAnsi="Times New Roman" w:cs="Times New Roman"/>
-          <w:lang w:val="tr-TR"/>
-        </w:rPr>
-      </w:pPr>
+      </w:pPr>
+      <w:r>
+        <w:drawing>
+          <wp:inline xmlns:a="http://schemas.openxmlformats.org/drawingml/2006/main" xmlns:pic="http://schemas.openxmlformats.org/drawingml/2006/picture">
+            <wp:extent cx="3430127" cy="2520000"/>
+            <wp:docPr id="900004" name="Picture 900004"/>
+            <wp:cNvGraphicFramePr>
+              <a:graphicFrameLocks noChangeAspect="1"/>
+            </wp:cNvGraphicFramePr>
+            <a:graphic>
+              <a:graphicData uri="http://schemas.openxmlformats.org/drawingml/2006/picture">
+                <pic:pic>
+                  <pic:nvPicPr>
+                    <pic:cNvPr id="0" name="2766080725_d.jpg"/>
+                    <pic:cNvPicPr/>
+                  </pic:nvPicPr>
+                  <pic:blipFill>
+                    <a:blip r:embed="rId12"/>
+                    <a:stretch>
+                      <a:fillRect/>
+                    </a:stretch>
+                  </pic:blipFill>
+                  <pic:spPr>
+                    <a:xfrm>
+                      <a:off x="0" y="0"/>
+                      <a:ext cx="3430127" cy="2520000"/>
+                    </a:xfrm>
+                    <a:prstGeom prst="rect"/>
+                  </pic:spPr>
+                </pic:pic>
+              </a:graphicData>
+            </a:graphic>
+          </wp:inline>
+        </w:drawing>
+      </w:r>
+    </w:p>
+    <w:p>
+      <w:pPr>
+        <w:jc w:val="center"/>
+      </w:pPr>
+      <w:r>
+        <w:rPr>
+          <w:rFonts w:ascii="Times New Roman" w:hAnsi="Times New Roman" w:cs="Times New Roman"/>
+          <w:b/>
+          <w:bCs/>
+          <w:highlight w:val="yellow"/>
+          <w:lang w:val="tr-TR"/>
+        </w:rPr>
+        <w:t xml:space="preserve">Shutter id: 2766080725</w:t>
+      </w:r>
     </w:p>
     <w:p>
       <w:pPr>

</xml_diff>